<commit_message>
Integre l'audit energetique et le devis reels dans le rapport Bloc 4
- Remplace toutes les hypotheses par les donnees sources : audit VINCI
  Energies (IPMVP, visite 17/04/2025) et devis Santerne 90 000 EUR HT.
- Existant : chaudiere gaz Ferroli 452 kW de 1987, aerothermes ; 3 690 m2 ;
  1 219 000 kWh/an soit 330,6 kWh/m2 ; repartition par usage reelle.
- Reglementaire : objectif 2030 a 221,5 kWh/m2, decret BACS (452 kW),
  lois APER et LOM chiffrees pour le site.
- Solution reelle : Daikin RXYQ36U 70,4 kW chaud / 89,5 kW froid en cour
  arriere, 1 gainable FXMQ-250A + 59 ml de gaine perforee + 4 cassettes,
  R-410A, liaisons Modbus/BACnet, CEE 11 000 EUR.
- Analyse critique enrichie (R-410A, TRA 15 ans, ecart budget/devis -27 %)
  et role personnel decrit sans surevaluation.
- Kit soutenance mis a jour avec les vraies valeurs.

Co-Authored-By: Claude Opus 5 <noreply@anthropic.com>
Claude-Session: https://claude.ai/code/session_013HeFSL5jx5KnB3FSreC4S1
</commit_message>
<xml_diff>
--- a/rapport/Kit_soutenance_et_pieces_manquantes.docx
+++ b/rapport/Kit_soutenance_et_pieces_manquantes.docx
@@ -1198,7 +1198,7 @@
               <w:rPr>
                 <w:sz w:val="16"/>
               </w:rPr>
-              <w:t>Pourquoi un VRV plutôt qu'un rooftop ou une PAC air/eau ?</w:t>
+              <w:t>Le site est-il assujetti au décret tertiaire ? Pourquoi ?</w:t>
             </w:r>
           </w:p>
         </w:tc>
@@ -1220,7 +1220,33 @@
               <w:rPr>
                 <w:sz w:val="16"/>
               </w:rPr>
-              <w:t>Voir 3.4.1 : rendement à charge partielle, zonage, compatibilité site occupé, absence d'eau en surface de vente</w:t>
+              <w:t xml:space="preserve">Oui : </w:t>
+            </w:r>
+            <w:r>
+              <w:rPr>
+                <w:b/>
+                <w:sz w:val="16"/>
+              </w:rPr>
+              <w:t>3 690 m²</w:t>
+            </w:r>
+            <w:r>
+              <w:rPr>
+                <w:sz w:val="16"/>
+              </w:rPr>
+              <w:t xml:space="preserve"> de surface tertiaire, seuil de 1 000 m². Base 369,2 kWh/m², objectif 2030 à </w:t>
+            </w:r>
+            <w:r>
+              <w:rPr>
+                <w:b/>
+                <w:sz w:val="16"/>
+              </w:rPr>
+              <w:t>221,5 kWh/m²</w:t>
+            </w:r>
+            <w:r>
+              <w:rPr>
+                <w:sz w:val="16"/>
+              </w:rPr>
+              <w:t xml:space="preserve"> (− 40 %)</w:t>
             </w:r>
           </w:p>
         </w:tc>
@@ -1245,7 +1271,7 @@
               <w:rPr>
                 <w:sz w:val="16"/>
               </w:rPr>
-              <w:t>Comment avez-vous dimensionné l'installation ?</w:t>
+              <w:t>Quel était l'existant ?</w:t>
             </w:r>
           </w:p>
         </w:tc>
@@ -1266,9 +1292,16 @@
             </w:r>
             <w:r>
               <w:rPr>
-                <w:sz w:val="16"/>
-              </w:rPr>
-              <w:t>Bilan thermique (3.5.1), spécificités supermarché, foisonnement, pression statique disponible</w:t>
+                <w:b/>
+                <w:sz w:val="16"/>
+              </w:rPr>
+              <w:t>Chaudière gaz FERROLI Frex N350, 452 kW, de 1987</w:t>
+            </w:r>
+            <w:r>
+              <w:rPr>
+                <w:sz w:val="16"/>
+              </w:rPr>
+              <w:t>, aérothermes à eau chaude, loi d'eau. Pas de climatisation hors zone frais (2 VRV Daikin de 2014)</w:t>
             </w:r>
           </w:p>
         </w:tc>
@@ -1292,7 +1325,7 @@
               <w:rPr>
                 <w:sz w:val="16"/>
               </w:rPr>
-              <w:t>Quel est le gain réel, et comment le prouvez-vous ?</w:t>
+              <w:t>Pourquoi un DRV plutôt qu'une chaudière à condensation ?</w:t>
             </w:r>
           </w:p>
         </w:tc>
@@ -1314,7 +1347,20 @@
               <w:rPr>
                 <w:sz w:val="16"/>
               </w:rPr>
-              <w:t>3.11.3 : correction climatique par DJU, raisonnement en kWh, sous-comptage — et reconnaissance honnête de la limite actuelle</w:t>
+              <w:t xml:space="preserve">La condensation coûtait 47 800 € pour 2 250 €/an (21,4 ans) </w:t>
+            </w:r>
+            <w:r>
+              <w:rPr>
+                <w:b/>
+                <w:sz w:val="16"/>
+              </w:rPr>
+              <w:t>sans apporter la climatisation ni sortir du gaz</w:t>
+            </w:r>
+            <w:r>
+              <w:rPr>
+                <w:sz w:val="16"/>
+              </w:rPr>
+              <w:t>. Le DRV traite les deux besoins avec un seul investissement</w:t>
             </w:r>
           </w:p>
         </w:tc>
@@ -1339,7 +1385,7 @@
               <w:rPr>
                 <w:sz w:val="16"/>
               </w:rPr>
-              <w:t>Le site est-il assujetti au décret tertiaire ? Pourquoi ?</w:t>
+              <w:t>Comment expliquez-vous de passer de 452 kW à 70,4 kW ?</w:t>
             </w:r>
           </w:p>
         </w:tc>
@@ -1362,7 +1408,20 @@
               <w:rPr>
                 <w:sz w:val="16"/>
               </w:rPr>
-              <w:t>Surface ≥ 1 000 m² affectée à une activité tertiaire (commerce) — voir 3.2.1</w:t>
+              <w:t xml:space="preserve">Surdimensionnement d'origine (1987), bâti isolé depuis, </w:t>
+            </w:r>
+            <w:r>
+              <w:rPr>
+                <w:b/>
+                <w:sz w:val="16"/>
+              </w:rPr>
+              <w:t>apports internes considérables</w:t>
+            </w:r>
+            <w:r>
+              <w:rPr>
+                <w:sz w:val="16"/>
+              </w:rPr>
+              <w:t xml:space="preserve"> (éclairage, occupants, rejets des groupes froids = 37 % des consos), et rendement d'émission d'un DRV sans commune mesure avec des aérothermes</w:t>
             </w:r>
           </w:p>
         </w:tc>
@@ -1386,7 +1445,7 @@
               <w:rPr>
                 <w:sz w:val="16"/>
               </w:rPr>
-              <w:t>Votre projet suffit-il à atteindre − 40 % en 2030 ?</w:t>
+              <w:t>Quel est le matériel installé ?</w:t>
             </w:r>
           </w:p>
         </w:tc>
@@ -1406,9 +1465,62 @@
             </w:r>
             <w:r>
               <w:rPr>
-                <w:sz w:val="16"/>
-              </w:rPr>
-              <w:t>Non, et c'est assumé : le froid alimentaire est le premier poste. Voir 3.3.3 et la feuille de route 3.10.3</w:t>
+                <w:b/>
+                <w:sz w:val="16"/>
+              </w:rPr>
+              <w:t>DAIKIN RXYQ36U</w:t>
+            </w:r>
+            <w:r>
+              <w:rPr>
+                <w:sz w:val="16"/>
+              </w:rPr>
+              <w:t xml:space="preserve"> (RXYQ20U + RXYQ16U), 70,4 kW chaud à − 10 °C / 89,5 kW froid, ETAS 162,4 % / 250,8 %, </w:t>
+            </w:r>
+            <w:r>
+              <w:rPr>
+                <w:b/>
+                <w:sz w:val="16"/>
+              </w:rPr>
+              <w:t>R-410A</w:t>
+            </w:r>
+            <w:r>
+              <w:rPr>
+                <w:sz w:val="16"/>
+              </w:rPr>
+              <w:t xml:space="preserve">, en cour arrière sur dalle. Côté intérieur : </w:t>
+            </w:r>
+            <w:r>
+              <w:rPr>
+                <w:b/>
+                <w:sz w:val="16"/>
+              </w:rPr>
+              <w:t>1 gainable FXMQ-250A</w:t>
+            </w:r>
+            <w:r>
+              <w:rPr>
+                <w:sz w:val="16"/>
+              </w:rPr>
+              <w:t xml:space="preserve"> (28 kW, 4 440 m³/h) + </w:t>
+            </w:r>
+            <w:r>
+              <w:rPr>
+                <w:b/>
+                <w:sz w:val="16"/>
+              </w:rPr>
+              <w:t>59 ml de gaine perforée SIONAIR Ø 550</w:t>
+            </w:r>
+            <w:r>
+              <w:rPr>
+                <w:sz w:val="16"/>
+              </w:rPr>
+              <w:t xml:space="preserve"> + </w:t>
+            </w:r>
+            <w:r>
+              <w:rPr>
+                <w:b/>
+                <w:sz w:val="16"/>
+              </w:rPr>
+              <w:t>4 cassettes Roundflow 125</w:t>
             </w:r>
           </w:p>
         </w:tc>
@@ -1433,7 +1545,7 @@
               <w:rPr>
                 <w:sz w:val="16"/>
               </w:rPr>
-              <w:t>Pourquoi le R-32 et pas le R-410A ?</w:t>
+              <w:t>Pourquoi du R-410A et pas du R-32 ?</w:t>
             </w:r>
           </w:p>
         </w:tc>
@@ -1454,9 +1566,16 @@
             </w:r>
             <w:r>
               <w:rPr>
-                <w:sz w:val="16"/>
-              </w:rPr>
-              <w:t>GWP 675 contre 2 088, trajectoire du règlement (UE) 2024/573, coût et disponibilité future du fluide</w:t>
+                <w:b/>
+                <w:sz w:val="16"/>
+              </w:rPr>
+              <w:t>C'est la limite du projet, à assumer</w:t>
+            </w:r>
+            <w:r>
+              <w:rPr>
+                <w:sz w:val="16"/>
+              </w:rPr>
+              <w:t xml:space="preserve"> : GWP 2 088 contre 675, choix lié à la gamme VRV IV et à la continuité avec le parc du site. Conséquence : recharges plus coûteuses et plus rares à terme, d'où une exigence renforcée d'étanchéité et de contrôles</w:t>
             </w:r>
           </w:p>
         </w:tc>
@@ -1480,7 +1599,7 @@
               <w:rPr>
                 <w:sz w:val="16"/>
               </w:rPr>
-              <w:t>Quelles sont vos obligations en tant qu'entreprise manipulant des fluides ?</w:t>
+              <w:t>Quel est le temps de retour ?</w:t>
             </w:r>
           </w:p>
         </w:tc>
@@ -1500,9 +1619,49 @@
             </w:r>
             <w:r>
               <w:rPr>
-                <w:sz w:val="16"/>
-              </w:rPr>
-              <w:t>Attestation de capacité, attestation d'aptitude, contrôles d'étanchéité, traçabilité</w:t>
+                <w:b/>
+                <w:sz w:val="16"/>
+              </w:rPr>
+              <w:t>5 260 €/an</w:t>
+            </w:r>
+            <w:r>
+              <w:rPr>
+                <w:sz w:val="16"/>
+              </w:rPr>
+              <w:t xml:space="preserve"> pour </w:t>
+            </w:r>
+            <w:r>
+              <w:rPr>
+                <w:b/>
+                <w:sz w:val="16"/>
+              </w:rPr>
+              <w:t>90 000 € HT</w:t>
+            </w:r>
+            <w:r>
+              <w:rPr>
+                <w:sz w:val="16"/>
+              </w:rPr>
+              <w:t xml:space="preserve">, soit </w:t>
+            </w:r>
+            <w:r>
+              <w:rPr>
+                <w:b/>
+                <w:sz w:val="16"/>
+              </w:rPr>
+              <w:t>79 000 € après CEE → ≈ 15 ans</w:t>
+            </w:r>
+            <w:r>
+              <w:rPr>
+                <w:sz w:val="16"/>
+              </w:rPr>
+              <w:t xml:space="preserve">. Le bouquet complet : 572 940 € pour 58 590 €/an → </w:t>
+            </w:r>
+            <w:r>
+              <w:rPr>
+                <w:b/>
+                <w:sz w:val="16"/>
+              </w:rPr>
+              <w:t>9,3 ans</w:t>
             </w:r>
           </w:p>
         </w:tc>
@@ -1527,7 +1686,7 @@
               <w:rPr>
                 <w:sz w:val="16"/>
               </w:rPr>
-              <w:t>Le décret BACS s'applique-t-il ?</w:t>
+              <w:t>Pourquoi un retour aussi long ? Pourquoi le faire alors ?</w:t>
             </w:r>
           </w:p>
         </w:tc>
@@ -1550,20 +1709,20 @@
               <w:rPr>
                 <w:sz w:val="16"/>
               </w:rPr>
-              <w:t>Selon la puissance installée : seuil de 70 kW au 1</w:t>
-            </w:r>
-            <w:r>
-              <w:rPr>
-                <w:sz w:val="16"/>
-                <w:vertAlign w:val="superscript"/>
-              </w:rPr>
-              <w:t>er</w:t>
-            </w:r>
-            <w:r>
-              <w:rPr>
-                <w:sz w:val="16"/>
-              </w:rPr>
-              <w:t xml:space="preserve"> janvier 2027 — anticipé par la régulation communicante</w:t>
+              <w:t xml:space="preserve">On substitue une énergie bon marché (gaz) par une énergie chère (électricité) </w:t>
+            </w:r>
+            <w:r>
+              <w:rPr>
+                <w:b/>
+                <w:sz w:val="16"/>
+              </w:rPr>
+              <w:t>et</w:t>
+            </w:r>
+            <w:r>
+              <w:rPr>
+                <w:sz w:val="16"/>
+              </w:rPr>
+              <w:t xml:space="preserve"> on ajoute un usage (+ 102 MWh, + 9 %). Ce qui justifie le projet : chaudière de 1987 en fin de vie, confort d'été sur 2 596 m², trajectoire décret tertiaire, décret BACS</w:t>
             </w:r>
           </w:p>
         </w:tc>
@@ -1587,7 +1746,7 @@
               <w:rPr>
                 <w:sz w:val="16"/>
               </w:rPr>
-              <w:t>Quelles règles encadrent le travail de nuit ?</w:t>
+              <w:t>Ce projet suffit-il pour le décret tertiaire ?</w:t>
             </w:r>
           </w:p>
         </w:tc>
@@ -1609,7 +1768,46 @@
               <w:rPr>
                 <w:sz w:val="16"/>
               </w:rPr>
-              <w:t>3.7.2 : période 21 h – 6 h, statut de travailleur de nuit, durées maximales, contreparties, suivi médical, interdiction pour les mineurs</w:t>
+              <w:t xml:space="preserve">Non, et c'est assumé : le chauffage ne pèse que </w:t>
+            </w:r>
+            <w:r>
+              <w:rPr>
+                <w:b/>
+                <w:sz w:val="16"/>
+              </w:rPr>
+              <w:t>13 %</w:t>
+            </w:r>
+            <w:r>
+              <w:rPr>
+                <w:sz w:val="16"/>
+              </w:rPr>
+              <w:t xml:space="preserve"> des consommations. C'est le </w:t>
+            </w:r>
+            <w:r>
+              <w:rPr>
+                <w:b/>
+                <w:sz w:val="16"/>
+              </w:rPr>
+              <w:t>bouquet</w:t>
+            </w:r>
+            <w:r>
+              <w:rPr>
+                <w:sz w:val="16"/>
+              </w:rPr>
+              <w:t xml:space="preserve"> (PAC + ECS thermo + PV + GTC + récupération de chaleur) qui mène à </w:t>
+            </w:r>
+            <w:r>
+              <w:rPr>
+                <w:b/>
+                <w:sz w:val="16"/>
+              </w:rPr>
+              <w:t>211,2 kWh/m²</w:t>
+            </w:r>
+            <w:r>
+              <w:rPr>
+                <w:sz w:val="16"/>
+              </w:rPr>
+              <w:t>, donc à la conformité</w:t>
             </w:r>
           </w:p>
         </w:tc>
@@ -1634,7 +1832,7 @@
               <w:rPr>
                 <w:sz w:val="16"/>
               </w:rPr>
-              <w:t>Comment avez-vous sécurisé le travail en nacelle ?</w:t>
+              <w:t>Comment le projet a-t-il été financé ?</w:t>
             </w:r>
           </w:p>
         </w:tc>
@@ -1655,9 +1853,42 @@
             </w:r>
             <w:r>
               <w:rPr>
-                <w:sz w:val="16"/>
-              </w:rPr>
-              <w:t>3.7.4 : PEMP, CACES R486, autorisation de conduite, VGP, harnais et longe courte, personne au sol formée aux manœuvres de secours</w:t>
+                <w:b/>
+                <w:sz w:val="16"/>
+              </w:rPr>
+              <w:t>CEE de 11 000 €</w:t>
+            </w:r>
+            <w:r>
+              <w:rPr>
+                <w:sz w:val="16"/>
+              </w:rPr>
+              <w:t xml:space="preserve"> via TotalEnergies Marketing France, mandataire GreenFlex, avec </w:t>
+            </w:r>
+            <w:r>
+              <w:rPr>
+                <w:b/>
+                <w:sz w:val="16"/>
+              </w:rPr>
+              <w:t>mandat de perception au profit de Santerne</w:t>
+            </w:r>
+            <w:r>
+              <w:rPr>
+                <w:sz w:val="16"/>
+              </w:rPr>
+              <w:t xml:space="preserve">. Règle clé : engagement de l'obligé </w:t>
+            </w:r>
+            <w:r>
+              <w:rPr>
+                <w:b/>
+                <w:sz w:val="16"/>
+              </w:rPr>
+              <w:t>avant</w:t>
+            </w:r>
+            <w:r>
+              <w:rPr>
+                <w:sz w:val="16"/>
+              </w:rPr>
+              <w:t xml:space="preserve"> signature du devis</w:t>
             </w:r>
           </w:p>
         </w:tc>
@@ -1681,7 +1912,7 @@
               <w:rPr>
                 <w:sz w:val="16"/>
               </w:rPr>
-              <w:t>Plan de prévention ou PPSPS ?</w:t>
+              <w:t>Pourquoi la GTB n'a-t-elle pas été installée tout de suite ?</w:t>
             </w:r>
           </w:p>
         </w:tc>
@@ -1703,7 +1934,20 @@
               <w:rPr>
                 <w:sz w:val="16"/>
               </w:rPr>
-              <w:t>3.7.6 : entreprise extérieure chez un utilisateur → plan de prévention ; SPS si plusieurs entreprises sur une opération de bâtiment</w:t>
+              <w:t xml:space="preserve">Recommandation explicite de l'audit : inutile de la poser avant de changer la production. Mais les </w:t>
+            </w:r>
+            <w:r>
+              <w:rPr>
+                <w:b/>
+                <w:sz w:val="16"/>
+              </w:rPr>
+              <w:t>liaisons Modbus/BACnet ont été posées</w:t>
+            </w:r>
+            <w:r>
+              <w:rPr>
+                <w:sz w:val="16"/>
+              </w:rPr>
+              <w:t xml:space="preserve"> (531,70 €), donc la GTC future se raccorde sans reprise</w:t>
             </w:r>
           </w:p>
         </w:tc>
@@ -1728,7 +1972,7 @@
               <w:rPr>
                 <w:sz w:val="16"/>
               </w:rPr>
-              <w:t>Comment avez-vous maintenu la sécurité incendie de l'ERP ?</w:t>
+              <w:t>Le site est-il concerné par d'autres obligations ?</w:t>
             </w:r>
           </w:p>
         </w:tc>
@@ -1751,7 +1995,46 @@
               <w:rPr>
                 <w:sz w:val="16"/>
               </w:rPr>
-              <w:t>GN 13, maintien des dégagements, permis de feu, remise en service de la détection, clapets coupe-feu, désenfumage non entravé</w:t>
+              <w:t xml:space="preserve">Oui : </w:t>
+            </w:r>
+            <w:r>
+              <w:rPr>
+                <w:b/>
+                <w:sz w:val="16"/>
+              </w:rPr>
+              <w:t>décret BACS</w:t>
+            </w:r>
+            <w:r>
+              <w:rPr>
+                <w:sz w:val="16"/>
+              </w:rPr>
+              <w:t xml:space="preserve"> (chaudière de 452 kW, échéance 2025 dépassée), </w:t>
+            </w:r>
+            <w:r>
+              <w:rPr>
+                <w:b/>
+                <w:sz w:val="16"/>
+              </w:rPr>
+              <w:t>loi APER</w:t>
+            </w:r>
+            <w:r>
+              <w:rPr>
+                <w:sz w:val="16"/>
+              </w:rPr>
+              <w:t xml:space="preserve"> (parking 3 179 m² → ≈ 1 480 m² d'ombrières avant 2028), </w:t>
+            </w:r>
+            <w:r>
+              <w:rPr>
+                <w:b/>
+                <w:sz w:val="16"/>
+              </w:rPr>
+              <w:t>loi LOM</w:t>
+            </w:r>
+            <w:r>
+              <w:rPr>
+                <w:sz w:val="16"/>
+              </w:rPr>
+              <w:t xml:space="preserve"> (120 places → 6 bornes dont 1 PMR)</w:t>
             </w:r>
           </w:p>
         </w:tc>
@@ -1775,7 +2058,7 @@
               <w:rPr>
                 <w:sz w:val="16"/>
               </w:rPr>
-              <w:t>Quel a été votre rôle exact ?</w:t>
+              <w:t>Quelles règles encadrent le travail de nuit ?</w:t>
             </w:r>
           </w:p>
         </w:tc>
@@ -1797,7 +2080,14 @@
               <w:rPr>
                 <w:sz w:val="16"/>
               </w:rPr>
-              <w:t>Diagnostic, conception, chiffrage, coordination, réalisation, mise en service, reprise en maintenance — voir 4.3.1</w:t>
+              <w:t xml:space="preserve">Période 21 h – 6 h, recours exceptionnel justifié par la continuité de l'activité, 8 h max par jour, 40 h en moyenne sur 12 semaines, contreparties en repos, surveillance médicale renforcée, </w:t>
+            </w:r>
+            <w:r>
+              <w:rPr>
+                <w:b/>
+                <w:sz w:val="16"/>
+              </w:rPr>
+              <w:t>interdiction totale pour les mineurs</w:t>
             </w:r>
           </w:p>
         </w:tc>
@@ -1822,7 +2112,7 @@
               <w:rPr>
                 <w:sz w:val="16"/>
               </w:rPr>
-              <w:t>Qu'auriez-vous fait différemment ?</w:t>
+              <w:t>Comment avez-vous sécurisé le travail en nacelle ?</w:t>
             </w:r>
           </w:p>
         </w:tc>
@@ -1845,7 +2135,33 @@
               <w:rPr>
                 <w:sz w:val="16"/>
               </w:rPr>
-              <w:t>4.2 : sous-comptage avant travaux, formalisation, CEE plus tôt, renfort d'équipe, feuille de route présentée d'emblée</w:t>
+              <w:t xml:space="preserve">PEMP, </w:t>
+            </w:r>
+            <w:r>
+              <w:rPr>
+                <w:b/>
+                <w:sz w:val="16"/>
+              </w:rPr>
+              <w:t>CACES R486</w:t>
+            </w:r>
+            <w:r>
+              <w:rPr>
+                <w:sz w:val="16"/>
+              </w:rPr>
+              <w:t xml:space="preserve">, autorisation de conduite, VGP tous les 6 mois, harnais avec longe courte, </w:t>
+            </w:r>
+            <w:r>
+              <w:rPr>
+                <w:b/>
+                <w:sz w:val="16"/>
+              </w:rPr>
+              <w:t>personne au sol formée aux manœuvres de secours</w:t>
+            </w:r>
+            <w:r>
+              <w:rPr>
+                <w:sz w:val="16"/>
+              </w:rPr>
+              <w:t>, zone au sol balisée</w:t>
             </w:r>
           </w:p>
         </w:tc>
@@ -1869,7 +2185,7 @@
               <w:rPr>
                 <w:sz w:val="16"/>
               </w:rPr>
-              <w:t>Comment prendriez-vous en compte un collaborateur en situation de handicap ?</w:t>
+              <w:t>Plan de prévention ou PPSPS ?</w:t>
             </w:r>
           </w:p>
         </w:tc>
@@ -1891,7 +2207,361 @@
               <w:rPr>
                 <w:sz w:val="16"/>
               </w:rPr>
-              <w:t>4.3.4 : aménagement de poste avec le médecin du travail et le référent handicap, affectation aux tâches de préfabrication au sol, adaptation des horaires</w:t>
+              <w:t xml:space="preserve">Entreprise extérieure chez un utilisateur → </w:t>
+            </w:r>
+            <w:r>
+              <w:rPr>
+                <w:b/>
+                <w:sz w:val="16"/>
+              </w:rPr>
+              <w:t>plan de prévention écrit</w:t>
+            </w:r>
+            <w:r>
+              <w:rPr>
+                <w:sz w:val="16"/>
+              </w:rPr>
+              <w:t xml:space="preserve"> obligatoire (&gt; 400 h/an et travaux dangereux). SPS si plusieurs entreprises sur une opération de bâtiment</w:t>
+            </w:r>
+          </w:p>
+        </w:tc>
+      </w:tr>
+      <w:tr>
+        <w:tc>
+          <w:tcPr>
+            <w:tcW w:type="dxa" w:w="5156"/>
+            <w:shd w:val="clear" w:fill="EEF2F7"/>
+          </w:tcPr>
+          <w:p>
+            <w:pPr>
+              <w:spacing w:after="0" w:before="0" w:line="240" w:lineRule="auto"/>
+              <w:jc w:val="left"/>
+            </w:pPr>
+            <w:r>
+              <w:rPr>
+                <w:sz w:val="16"/>
+              </w:rPr>
+            </w:r>
+            <w:r>
+              <w:rPr>
+                <w:sz w:val="16"/>
+              </w:rPr>
+              <w:t>Comment avez-vous maintenu la sécurité incendie de l'ERP ?</w:t>
+            </w:r>
+          </w:p>
+        </w:tc>
+        <w:tc>
+          <w:tcPr>
+            <w:tcW w:type="dxa" w:w="5156"/>
+            <w:shd w:val="clear" w:fill="EEF2F7"/>
+          </w:tcPr>
+          <w:p>
+            <w:pPr>
+              <w:spacing w:after="0" w:before="0" w:line="240" w:lineRule="auto"/>
+              <w:jc w:val="left"/>
+            </w:pPr>
+            <w:r>
+              <w:rPr>
+                <w:sz w:val="16"/>
+              </w:rPr>
+            </w:r>
+            <w:r>
+              <w:rPr>
+                <w:b/>
+                <w:sz w:val="16"/>
+              </w:rPr>
+              <w:t>GN 13</w:t>
+            </w:r>
+            <w:r>
+              <w:rPr>
+                <w:sz w:val="16"/>
+              </w:rPr>
+              <w:t xml:space="preserve"> : dégagements libres, permis de feu pour les brasages, détection remise en service </w:t>
+            </w:r>
+            <w:r>
+              <w:rPr>
+                <w:b/>
+                <w:sz w:val="16"/>
+              </w:rPr>
+              <w:t>avant 4 h 45</w:t>
+            </w:r>
+            <w:r>
+              <w:rPr>
+                <w:sz w:val="16"/>
+              </w:rPr>
+              <w:t>, clapets coupe-feu aux traversées, désenfumage non entravé</w:t>
+            </w:r>
+          </w:p>
+        </w:tc>
+      </w:tr>
+      <w:tr>
+        <w:tc>
+          <w:tcPr>
+            <w:tcW w:type="dxa" w:w="5156"/>
+          </w:tcPr>
+          <w:p>
+            <w:pPr>
+              <w:spacing w:after="0" w:before="0" w:line="240" w:lineRule="auto"/>
+              <w:jc w:val="left"/>
+            </w:pPr>
+            <w:r>
+              <w:rPr>
+                <w:sz w:val="16"/>
+              </w:rPr>
+            </w:r>
+            <w:r>
+              <w:rPr>
+                <w:sz w:val="16"/>
+              </w:rPr>
+              <w:t>Quel a été votre rôle exact ?</w:t>
+            </w:r>
+          </w:p>
+        </w:tc>
+        <w:tc>
+          <w:tcPr>
+            <w:tcW w:type="dxa" w:w="5156"/>
+          </w:tcPr>
+          <w:p>
+            <w:pPr>
+              <w:spacing w:after="0" w:before="0" w:line="240" w:lineRule="auto"/>
+              <w:jc w:val="left"/>
+            </w:pPr>
+            <w:r>
+              <w:rPr>
+                <w:sz w:val="16"/>
+              </w:rPr>
+            </w:r>
+            <w:r>
+              <w:rPr>
+                <w:b/>
+                <w:sz w:val="16"/>
+              </w:rPr>
+              <w:t>Chargé de maintenance</w:t>
+            </w:r>
+            <w:r>
+              <w:rPr>
+                <w:sz w:val="16"/>
+              </w:rPr>
+              <w:t xml:space="preserve"> : entretiens, dépannages, devis. Sur ce projet : </w:t>
+            </w:r>
+            <w:r>
+              <w:rPr>
+                <w:b/>
+                <w:sz w:val="16"/>
+              </w:rPr>
+              <w:t>participation à l'audit</w:t>
+            </w:r>
+            <w:r>
+              <w:rPr>
+                <w:sz w:val="16"/>
+              </w:rPr>
+              <w:t xml:space="preserve"> (visite, relevés, historique d'exploitation) et </w:t>
+            </w:r>
+            <w:r>
+              <w:rPr>
+                <w:b/>
+                <w:sz w:val="16"/>
+              </w:rPr>
+              <w:t>réalisation d'une partie du chantier</w:t>
+            </w:r>
+            <w:r>
+              <w:rPr>
+                <w:sz w:val="16"/>
+              </w:rPr>
+              <w:t>, puis reprise de l'installation en maintenance. Ne pas surjouer : c'est plus crédible</w:t>
+            </w:r>
+          </w:p>
+        </w:tc>
+      </w:tr>
+      <w:tr>
+        <w:tc>
+          <w:tcPr>
+            <w:tcW w:type="dxa" w:w="5156"/>
+            <w:shd w:val="clear" w:fill="EEF2F7"/>
+          </w:tcPr>
+          <w:p>
+            <w:pPr>
+              <w:spacing w:after="0" w:before="0" w:line="240" w:lineRule="auto"/>
+              <w:jc w:val="left"/>
+            </w:pPr>
+            <w:r>
+              <w:rPr>
+                <w:sz w:val="16"/>
+              </w:rPr>
+            </w:r>
+            <w:r>
+              <w:rPr>
+                <w:sz w:val="16"/>
+              </w:rPr>
+              <w:t>Qu'auriez-vous fait différemment ?</w:t>
+            </w:r>
+          </w:p>
+        </w:tc>
+        <w:tc>
+          <w:tcPr>
+            <w:tcW w:type="dxa" w:w="5156"/>
+            <w:shd w:val="clear" w:fill="EEF2F7"/>
+          </w:tcPr>
+          <w:p>
+            <w:pPr>
+              <w:spacing w:after="0" w:before="0" w:line="240" w:lineRule="auto"/>
+              <w:jc w:val="left"/>
+            </w:pPr>
+            <w:r>
+              <w:rPr>
+                <w:sz w:val="16"/>
+              </w:rPr>
+            </w:r>
+            <w:r>
+              <w:rPr>
+                <w:sz w:val="16"/>
+              </w:rPr>
+              <w:t xml:space="preserve">R-32 plutôt que R-410A ; </w:t>
+            </w:r>
+            <w:r>
+              <w:rPr>
+                <w:b/>
+                <w:sz w:val="16"/>
+              </w:rPr>
+              <w:t>sous-comptage du poste chauffage avant travaux</w:t>
+            </w:r>
+            <w:r>
+              <w:rPr>
+                <w:sz w:val="16"/>
+              </w:rPr>
+              <w:t xml:space="preserve"> ; recalcul du TRA après l'écart budget/devis (− 27 %) ; formalisation écrite du suivi ; ordre du bouquet discuté avec le client</w:t>
+            </w:r>
+          </w:p>
+        </w:tc>
+      </w:tr>
+      <w:tr>
+        <w:tc>
+          <w:tcPr>
+            <w:tcW w:type="dxa" w:w="5156"/>
+          </w:tcPr>
+          <w:p>
+            <w:pPr>
+              <w:spacing w:after="0" w:before="0" w:line="240" w:lineRule="auto"/>
+              <w:jc w:val="left"/>
+            </w:pPr>
+            <w:r>
+              <w:rPr>
+                <w:sz w:val="16"/>
+              </w:rPr>
+            </w:r>
+            <w:r>
+              <w:rPr>
+                <w:sz w:val="16"/>
+              </w:rPr>
+              <w:t>Comment prouverez-vous le gain réel ?</w:t>
+            </w:r>
+          </w:p>
+        </w:tc>
+        <w:tc>
+          <w:tcPr>
+            <w:tcW w:type="dxa" w:w="5156"/>
+          </w:tcPr>
+          <w:p>
+            <w:pPr>
+              <w:spacing w:after="0" w:before="0" w:line="240" w:lineRule="auto"/>
+              <w:jc w:val="left"/>
+            </w:pPr>
+            <w:r>
+              <w:rPr>
+                <w:sz w:val="16"/>
+              </w:rPr>
+            </w:r>
+            <w:r>
+              <w:rPr>
+                <w:sz w:val="16"/>
+              </w:rPr>
+              <w:t xml:space="preserve">Correction climatique par </w:t>
+            </w:r>
+            <w:r>
+              <w:rPr>
+                <w:b/>
+                <w:sz w:val="16"/>
+              </w:rPr>
+              <w:t>DJU</w:t>
+            </w:r>
+            <w:r>
+              <w:rPr>
+                <w:sz w:val="16"/>
+              </w:rPr>
+              <w:t>, raisonnement en kWh avant euros, exploitation d'</w:t>
+            </w:r>
+            <w:r>
+              <w:rPr>
+                <w:b/>
+                <w:sz w:val="16"/>
+              </w:rPr>
+              <w:t>ENERGISME</w:t>
+            </w:r>
+            <w:r>
+              <w:rPr>
+                <w:sz w:val="16"/>
+              </w:rPr>
+              <w:t xml:space="preserve"> et de la déclaration </w:t>
+            </w:r>
+            <w:r>
+              <w:rPr>
+                <w:b/>
+                <w:sz w:val="16"/>
+              </w:rPr>
+              <w:t>OPERAT</w:t>
+            </w:r>
+            <w:r>
+              <w:rPr>
+                <w:sz w:val="16"/>
+              </w:rPr>
+              <w:t>, comparaison sur une année pleine minimum</w:t>
+            </w:r>
+          </w:p>
+        </w:tc>
+      </w:tr>
+      <w:tr>
+        <w:tc>
+          <w:tcPr>
+            <w:tcW w:type="dxa" w:w="5156"/>
+            <w:shd w:val="clear" w:fill="EEF2F7"/>
+          </w:tcPr>
+          <w:p>
+            <w:pPr>
+              <w:spacing w:after="0" w:before="0" w:line="240" w:lineRule="auto"/>
+              <w:jc w:val="left"/>
+            </w:pPr>
+            <w:r>
+              <w:rPr>
+                <w:sz w:val="16"/>
+              </w:rPr>
+            </w:r>
+            <w:r>
+              <w:rPr>
+                <w:sz w:val="16"/>
+              </w:rPr>
+              <w:t>Prise en compte d'un collaborateur en situation de handicap ?</w:t>
+            </w:r>
+          </w:p>
+        </w:tc>
+        <w:tc>
+          <w:tcPr>
+            <w:tcW w:type="dxa" w:w="5156"/>
+            <w:shd w:val="clear" w:fill="EEF2F7"/>
+          </w:tcPr>
+          <w:p>
+            <w:pPr>
+              <w:spacing w:after="0" w:before="0" w:line="240" w:lineRule="auto"/>
+              <w:jc w:val="left"/>
+            </w:pPr>
+            <w:r>
+              <w:rPr>
+                <w:sz w:val="16"/>
+              </w:rPr>
+            </w:r>
+            <w:r>
+              <w:rPr>
+                <w:sz w:val="16"/>
+              </w:rPr>
+              <w:t>Aménagement de poste avec le médecin du travail et le référent handicap : affectation aux tâches de préfabrication au sol plutôt qu'en nacelle, adaptation des horaires, accessibilité des zones</w:t>
             </w:r>
           </w:p>
         </w:tc>
@@ -1907,23 +2577,7 @@
         <w:pStyle w:val="Heading2"/>
       </w:pPr>
       <w:r>
-        <w:t>Annexe F — Liste des éléments manquants à me fournir</w:t>
-      </w:r>
-    </w:p>
-    <w:p>
-      <w:pPr>
-        <w:spacing w:before="100" w:after="140"/>
-        <w:ind w:left="283"/>
-        <w:pBdr>
-          <w:left w:val="single" w:sz="18" w:space="6" w:color="003A70"/>
-        </w:pBdr>
-        <w:shd w:val="clear" w:fill="F2F6FA"/>
-      </w:pPr>
-      <w:r>
-        <w:rPr>
-          <w:sz w:val="20"/>
-        </w:rPr>
-        <w:t>Cette annexe est un outil de travail interne : elle recense tout ce qui reste à obtenir pour finaliser le rapport.</w:t>
+        <w:t>Annexe F — Ce qu'il reste à obtenir</w:t>
       </w:r>
     </w:p>
     <w:p>
@@ -1931,7 +2585,7 @@
         <w:rPr>
           <w:b/>
         </w:rPr>
-        <w:t>Priorité 1 — indispensables</w:t>
+        <w:t>Priorité 1 — pour finaliser le rapport</w:t>
       </w:r>
     </w:p>
     <w:p>
@@ -1945,10 +2599,10 @@
         <w:rPr>
           <w:b/>
         </w:rPr>
-        <w:t>Rapport de DPE</w:t>
+        <w:t>Dates réelles du chantier</w:t>
       </w:r>
       <w:r>
-        <w:t xml:space="preserve"> complet (étiquettes, consommations par usage, préconisations).</w:t>
+        <w:t xml:space="preserve"> : début, fin, nombre de nuits, durée des postes.</w:t>
       </w:r>
     </w:p>
     <w:p>
@@ -1962,10 +2616,10 @@
         <w:rPr>
           <w:b/>
         </w:rPr>
-        <w:t>Références du matériel VRV</w:t>
+        <w:t>2 ou 3 aléas concrets</w:t>
       </w:r>
       <w:r>
-        <w:t xml:space="preserve"> installé : groupes extérieurs, unités intérieures, régulation, avec SCOP, SEER, puissances, fluide et charge.</w:t>
+        <w:t xml:space="preserve"> survenus pendant les travaux et les décisions prises — c'est ce que le jury interrogera, et c'est la seule chose qui ne peut pas être reconstituée.</w:t>
       </w:r>
     </w:p>
     <w:p>
@@ -1979,10 +2633,10 @@
         <w:rPr>
           <w:b/>
         </w:rPr>
-        <w:t>Montant du devis</w:t>
+        <w:t>Confirmation de la configuration posée</w:t>
       </w:r>
       <w:r>
-        <w:t xml:space="preserve"> et sa décomposition par poste.</w:t>
+        <w:t xml:space="preserve"> : le devis décrit 1 gainable + 4 cassettes, toutes en surface de vente. Si le DOE diffère (unité en réserve, cassettes supplémentaires), il faut corriger la section 3.4.3.</w:t>
       </w:r>
     </w:p>
     <w:p>
@@ -1996,10 +2650,18 @@
         <w:rPr>
           <w:b/>
         </w:rPr>
-        <w:t>Surface de vente et surface totale</w:t>
+        <w:t>Photos du chantier</w:t>
       </w:r>
       <w:r>
-        <w:t xml:space="preserve"> du magasin, hauteur sous plafond.</w:t>
+        <w:t>, en particulier de nuit et en nacelle — indispensables pour la soutenance.</w:t>
+      </w:r>
+    </w:p>
+    <w:p>
+      <w:r>
+        <w:rPr>
+          <w:b/>
+        </w:rPr>
+        <w:t>Priorité 2 — pour renforcer les résultats</w:t>
       </w:r>
     </w:p>
     <w:p>
@@ -2013,10 +2675,10 @@
         <w:rPr>
           <w:b/>
         </w:rPr>
-        <w:t>Nature exacte du système de chauffage remplacé</w:t>
+        <w:t>Consommations après travaux</w:t>
       </w:r>
       <w:r>
-        <w:t xml:space="preserve"> (énergie, technologie, puissance, âge).</w:t>
+        <w:t xml:space="preserve"> (ENERGISME ou factures) sur une saison de chauffe complète.</w:t>
       </w:r>
     </w:p>
     <w:p>
@@ -2030,78 +2692,10 @@
         <w:rPr>
           <w:b/>
         </w:rPr>
-        <w:t>Consommations avant travaux</w:t>
+        <w:t>Charge réelle de R-410A</w:t>
       </w:r>
       <w:r>
-        <w:t xml:space="preserve"> (électricité et gaz sur 3 ans) et </w:t>
-      </w:r>
-      <w:r>
-        <w:rPr>
-          <w:b/>
-        </w:rPr>
-        <w:t>après travaux</w:t>
-      </w:r>
-      <w:r>
-        <w:t xml:space="preserve"> si disponibles.</w:t>
-      </w:r>
-    </w:p>
-    <w:p>
-      <w:r>
-        <w:rPr>
-          <w:b/>
-        </w:rPr>
-        <w:t>Priorité 2 — importants</w:t>
-      </w:r>
-    </w:p>
-    <w:p>
-      <w:pPr>
-        <w:pStyle w:val="ListNumber"/>
-        <w:spacing w:after="40"/>
-        <w:ind w:left="397"/>
-        <w:jc w:val="both"/>
-      </w:pPr>
-      <w:r>
-        <w:t>Dates réelles de début et de fin de chantier, nombre de nuits, durée des postes.</w:t>
-      </w:r>
-    </w:p>
-    <w:p>
-      <w:pPr>
-        <w:pStyle w:val="ListNumber"/>
-        <w:spacing w:after="40"/>
-        <w:ind w:left="397"/>
-        <w:jc w:val="both"/>
-      </w:pPr>
-      <w:r>
-        <w:t>Nom et fonction de l'</w:t>
-      </w:r>
-      <w:r>
-        <w:rPr>
-          <w:b/>
-        </w:rPr>
-        <w:t>ingénieur énergéticien VINCI</w:t>
-      </w:r>
-      <w:r>
-        <w:t xml:space="preserve"> qui a réalisé le DPE.</w:t>
-      </w:r>
-    </w:p>
-    <w:p>
-      <w:pPr>
-        <w:pStyle w:val="ListNumber"/>
-        <w:spacing w:after="40"/>
-        <w:ind w:left="397"/>
-        <w:jc w:val="both"/>
-      </w:pPr>
-      <w:r>
-        <w:t xml:space="preserve">Existence et montant de la </w:t>
-      </w:r>
-      <w:r>
-        <w:rPr>
-          <w:b/>
-        </w:rPr>
-        <w:t>prime CEE</w:t>
-      </w:r>
-      <w:r>
-        <w:t xml:space="preserve"> obtenue.</w:t>
+        <w:t xml:space="preserve"> figurant au DOE, pour calculer l'impact potentiel en t CO₂e.</w:t>
       </w:r>
     </w:p>
     <w:p>
@@ -2118,7 +2712,7 @@
         <w:t>Catégorie ERP</w:t>
       </w:r>
       <w:r>
-        <w:t xml:space="preserve"> et effectif théorique du magasin (registre de sécurité ou dernier PV de commission).</w:t>
+        <w:t xml:space="preserve"> du magasin et effectif théorique (registre de sécurité ou dernier PV de commission).</w:t>
       </w:r>
     </w:p>
     <w:p>
@@ -2132,29 +2726,10 @@
         <w:rPr>
           <w:b/>
         </w:rPr>
-        <w:t>Aléas réellement rencontrés</w:t>
+        <w:t>Nom et fonction de l'ingénieur énergéticien</w:t>
       </w:r>
       <w:r>
-        <w:t xml:space="preserve"> pendant le chantier et décisions prises (2 ou 3 exemples concrets suffisent — c'est ce que le jury interrogera).</w:t>
-      </w:r>
-    </w:p>
-    <w:p>
-      <w:pPr>
-        <w:pStyle w:val="ListNumber"/>
-        <w:spacing w:after="40"/>
-        <w:ind w:left="397"/>
-        <w:jc w:val="both"/>
-      </w:pPr>
-      <w:r>
-        <w:t>Année de construction du bâtiment (pour le volet amiante) et présence d'un DTA.</w:t>
-      </w:r>
-    </w:p>
-    <w:p>
-      <w:r>
-        <w:rPr>
-          <w:b/>
-        </w:rPr>
-        <w:t>Priorité 3 — utiles</w:t>
+        <w:t xml:space="preserve"> VINCI Energies auteur de l'audit.</w:t>
       </w:r>
     </w:p>
     <w:p>
@@ -2168,10 +2743,18 @@
         <w:rPr>
           <w:b/>
         </w:rPr>
-        <w:t>Photos du chantier</w:t>
+        <w:t>Date de signature du devis</w:t>
       </w:r>
       <w:r>
-        <w:t>, en particulier de nuit et en nacelle.</w:t>
+        <w:t xml:space="preserve"> et confirmation du versement de la prime CEE.</w:t>
+      </w:r>
+    </w:p>
+    <w:p>
+      <w:r>
+        <w:rPr>
+          <w:b/>
+        </w:rPr>
+        <w:t>Priorité 3 — pour la partie 2</w:t>
       </w:r>
     </w:p>
     <w:p>
@@ -2182,7 +2765,7 @@
         <w:jc w:val="both"/>
       </w:pPr>
       <w:r>
-        <w:t>Plans d'implantation et schéma de principe.</w:t>
+        <w:t>Nombre de sites suivis, de visites préventives et de dépannages par an, taux de transformation de vos devis.</w:t>
       </w:r>
     </w:p>
     <w:p>
@@ -2193,18 +2776,7 @@
         <w:jc w:val="both"/>
       </w:pPr>
       <w:r>
-        <w:t>Nombre de sites et de dépannages de votre portefeuille de maintenance (pour la partie 2).</w:t>
-      </w:r>
-    </w:p>
-    <w:p>
-      <w:pPr>
-        <w:pStyle w:val="ListNumber"/>
-        <w:spacing w:after="40"/>
-        <w:ind w:left="397"/>
-        <w:jc w:val="both"/>
-      </w:pPr>
-      <w:r>
-        <w:t>Certifications détenues par l'entreprise (MASE, QUALIBAT, ISO, attestation de capacité).</w:t>
+        <w:t>Certifications de l'entreprise (MASE, QUALIBAT, ISO, attestation de capacité fluides).</w:t>
       </w:r>
     </w:p>
     <w:p>
@@ -2226,7 +2798,7 @@
         <w:jc w:val="both"/>
       </w:pPr>
       <w:r>
-        <w:t>Retour écrit du client sur la satisfaction.</w:t>
+        <w:t>Retour écrit du client sur sa satisfaction.</w:t>
       </w:r>
     </w:p>
     <w:p>

</xml_diff>

<commit_message>
Complete le rapport : dates reelles, alea du temps de nuit double, charge 38 kg
- Chantier mi-avril a mi-juin 2026, avec analyse du choix de la periode
  (sortie de saison de chauffe).
- Alea majeur documente en 3.9.2 : temps de nuit double par rapport au
  chiffrage, causes, consequences economiques et humaines, correction a
  apporter aux futurs chiffrages de nuit.
- Charge de 38 kg de R-410A exploitee : 79,3 tCO2e, soit 4,8 annees de gain
  annuel, et franchissement du seuil des 50 tCO2e imposant un controle
  d'etancheite semestriel.
- Configuration confirmee d'apres le devis (1 gainable + 4 cassettes).
- Annexe de correspondance avec la grille d'evaluation resserree et verifiee.

Co-Authored-By: Claude Opus 5 <noreply@anthropic.com>
Claude-Session: https://claude.ai/code/session_013HeFSL5jx5KnB3FSreC4S1
</commit_message>
<xml_diff>
--- a/rapport/Kit_soutenance_et_pieces_manquantes.docx
+++ b/rapport/Kit_soutenance_et_pieces_manquantes.docx
@@ -697,7 +697,20 @@
               <w:rPr>
                 <w:sz w:val="16"/>
               </w:rPr>
-              <w:t>Les contraintes et les mesures de sécurité — point fort du projet</w:t>
+              <w:t xml:space="preserve">Les contraintes, les mesures de sécurité et </w:t>
+            </w:r>
+            <w:r>
+              <w:rPr>
+                <w:b/>
+                <w:sz w:val="16"/>
+              </w:rPr>
+              <w:t>l'aléa du temps de nuit doublé</w:t>
+            </w:r>
+            <w:r>
+              <w:rPr>
+                <w:sz w:val="16"/>
+              </w:rPr>
+              <w:t xml:space="preserve"> — point fort du projet</w:t>
             </w:r>
           </w:p>
         </w:tc>
@@ -2392,7 +2405,7 @@
               <w:rPr>
                 <w:sz w:val="16"/>
               </w:rPr>
-              <w:t>Qu'auriez-vous fait différemment ?</w:t>
+              <w:t>Quelle a été la charge de fluide, et qu'est-ce que cela implique ?</w:t>
             </w:r>
           </w:p>
         </w:tc>
@@ -2413,6 +2426,153 @@
             </w:r>
             <w:r>
               <w:rPr>
+                <w:b/>
+                <w:sz w:val="16"/>
+              </w:rPr>
+              <w:t>38 kg de R-410A = 79,3 t CO₂e</w:t>
+            </w:r>
+            <w:r>
+              <w:rPr>
+                <w:sz w:val="16"/>
+              </w:rPr>
+              <w:t xml:space="preserve">, soit </w:t>
+            </w:r>
+            <w:r>
+              <w:rPr>
+                <w:b/>
+                <w:sz w:val="16"/>
+              </w:rPr>
+              <w:t>4,8 années du gain annuel</w:t>
+            </w:r>
+            <w:r>
+              <w:rPr>
+                <w:sz w:val="16"/>
+              </w:rPr>
+              <w:t xml:space="preserve"> (16,7 t/an). Au-dessus de </w:t>
+            </w:r>
+            <w:r>
+              <w:rPr>
+                <w:b/>
+                <w:sz w:val="16"/>
+              </w:rPr>
+              <w:t>50 t CO₂e</w:t>
+            </w:r>
+            <w:r>
+              <w:rPr>
+                <w:sz w:val="16"/>
+              </w:rPr>
+              <w:t xml:space="preserve"> → </w:t>
+            </w:r>
+            <w:r>
+              <w:rPr>
+                <w:b/>
+                <w:sz w:val="16"/>
+              </w:rPr>
+              <w:t>contrôle d'étanchéité semestriel</w:t>
+            </w:r>
+            <w:r>
+              <w:rPr>
+                <w:sz w:val="16"/>
+              </w:rPr>
+              <w:t xml:space="preserve"> au lieu d'annuel. Au R-32 : 25,7 t, contrôle annuel</w:t>
+            </w:r>
+          </w:p>
+        </w:tc>
+      </w:tr>
+      <w:tr>
+        <w:tc>
+          <w:tcPr>
+            <w:tcW w:type="dxa" w:w="5156"/>
+          </w:tcPr>
+          <w:p>
+            <w:pPr>
+              <w:spacing w:after="0" w:before="0" w:line="240" w:lineRule="auto"/>
+              <w:jc w:val="left"/>
+            </w:pPr>
+            <w:r>
+              <w:rPr>
+                <w:sz w:val="16"/>
+              </w:rPr>
+            </w:r>
+            <w:r>
+              <w:rPr>
+                <w:sz w:val="16"/>
+              </w:rPr>
+              <w:t>Quel aléa avez-vous rencontré ?</w:t>
+            </w:r>
+          </w:p>
+        </w:tc>
+        <w:tc>
+          <w:tcPr>
+            <w:tcW w:type="dxa" w:w="5156"/>
+          </w:tcPr>
+          <w:p>
+            <w:pPr>
+              <w:spacing w:after="0" w:before="0" w:line="240" w:lineRule="auto"/>
+              <w:jc w:val="left"/>
+            </w:pPr>
+            <w:r>
+              <w:rPr>
+                <w:sz w:val="16"/>
+              </w:rPr>
+            </w:r>
+            <w:r>
+              <w:rPr>
+                <w:b/>
+                <w:sz w:val="16"/>
+              </w:rPr>
+              <w:t>Le temps de nuit a doublé</w:t>
+            </w:r>
+            <w:r>
+              <w:rPr>
+                <w:sz w:val="16"/>
+              </w:rPr>
+              <w:t xml:space="preserve"> par rapport au chiffrage. Délai calendaire tenu (mi-avril → mi-juin 2026), mais écart absorbé par l'entreprise. Causes : fenêtre utile de 8 h, montage/repli quotidien, 70 % en nacelle, 59 ml de gaine, fatigue. Correction : distinguer au devis temps de production et temps de mise en place, et appliquer un coefficient de productivité nocturne</w:t>
+            </w:r>
+          </w:p>
+        </w:tc>
+      </w:tr>
+      <w:tr>
+        <w:tc>
+          <w:tcPr>
+            <w:tcW w:type="dxa" w:w="5156"/>
+            <w:shd w:val="clear" w:fill="EEF2F7"/>
+          </w:tcPr>
+          <w:p>
+            <w:pPr>
+              <w:spacing w:after="0" w:before="0" w:line="240" w:lineRule="auto"/>
+              <w:jc w:val="left"/>
+            </w:pPr>
+            <w:r>
+              <w:rPr>
+                <w:sz w:val="16"/>
+              </w:rPr>
+            </w:r>
+            <w:r>
+              <w:rPr>
+                <w:sz w:val="16"/>
+              </w:rPr>
+              <w:t>Qu'auriez-vous fait différemment ?</w:t>
+            </w:r>
+          </w:p>
+        </w:tc>
+        <w:tc>
+          <w:tcPr>
+            <w:tcW w:type="dxa" w:w="5156"/>
+            <w:shd w:val="clear" w:fill="EEF2F7"/>
+          </w:tcPr>
+          <w:p>
+            <w:pPr>
+              <w:spacing w:after="0" w:before="0" w:line="240" w:lineRule="auto"/>
+              <w:jc w:val="left"/>
+            </w:pPr>
+            <w:r>
+              <w:rPr>
+                <w:sz w:val="16"/>
+              </w:rPr>
+            </w:r>
+            <w:r>
+              <w:rPr>
                 <w:sz w:val="16"/>
               </w:rPr>
               <w:t xml:space="preserve">R-32 plutôt que R-410A ; </w:t>
@@ -2422,13 +2582,26 @@
                 <w:b/>
                 <w:sz w:val="16"/>
               </w:rPr>
+              <w:t>chiffrage du travail de nuit</w:t>
+            </w:r>
+            <w:r>
+              <w:rPr>
+                <w:sz w:val="16"/>
+              </w:rPr>
+              <w:t xml:space="preserve"> avec coefficient de productivité ; </w:t>
+            </w:r>
+            <w:r>
+              <w:rPr>
+                <w:b/>
+                <w:sz w:val="16"/>
+              </w:rPr>
               <w:t>sous-comptage du poste chauffage avant travaux</w:t>
             </w:r>
             <w:r>
               <w:rPr>
                 <w:sz w:val="16"/>
               </w:rPr>
-              <w:t xml:space="preserve"> ; recalcul du TRA après l'écart budget/devis (− 27 %) ; formalisation écrite du suivi ; ordre du bouquet discuté avec le client</w:t>
+              <w:t xml:space="preserve"> ; recalcul du TRA après l'écart budget/devis (− 27 %) ; renfort d'équipe sur les phases lourdes</w:t>
             </w:r>
           </w:p>
         </w:tc>
@@ -2585,7 +2758,7 @@
         <w:rPr>
           <w:b/>
         </w:rPr>
-        <w:t>Priorité 1 — pour finaliser le rapport</w:t>
+        <w:t>Utile pour renforcer le rapport</w:t>
       </w:r>
     </w:p>
     <w:p>
@@ -2599,69 +2772,10 @@
         <w:rPr>
           <w:b/>
         </w:rPr>
-        <w:t>Dates réelles du chantier</w:t>
+        <w:t>Nombre de nuits réellement effectuées</w:t>
       </w:r>
       <w:r>
-        <w:t xml:space="preserve"> : début, fin, nombre de nuits, durée des postes.</w:t>
-      </w:r>
-    </w:p>
-    <w:p>
-      <w:pPr>
-        <w:pStyle w:val="ListNumber"/>
-        <w:spacing w:after="40"/>
-        <w:ind w:left="397"/>
-        <w:jc w:val="both"/>
-      </w:pPr>
-      <w:r>
-        <w:rPr>
-          <w:b/>
-        </w:rPr>
-        <w:t>2 ou 3 aléas concrets</w:t>
-      </w:r>
-      <w:r>
-        <w:t xml:space="preserve"> survenus pendant les travaux et les décisions prises — c'est ce que le jury interrogera, et c'est la seule chose qui ne peut pas être reconstituée.</w:t>
-      </w:r>
-    </w:p>
-    <w:p>
-      <w:pPr>
-        <w:pStyle w:val="ListNumber"/>
-        <w:spacing w:after="40"/>
-        <w:ind w:left="397"/>
-        <w:jc w:val="both"/>
-      </w:pPr>
-      <w:r>
-        <w:rPr>
-          <w:b/>
-        </w:rPr>
-        <w:t>Confirmation de la configuration posée</w:t>
-      </w:r>
-      <w:r>
-        <w:t xml:space="preserve"> : le devis décrit 1 gainable + 4 cassettes, toutes en surface de vente. Si le DOE diffère (unité en réserve, cassettes supplémentaires), il faut corriger la section 3.4.3.</w:t>
-      </w:r>
-    </w:p>
-    <w:p>
-      <w:pPr>
-        <w:pStyle w:val="ListNumber"/>
-        <w:spacing w:after="40"/>
-        <w:ind w:left="397"/>
-        <w:jc w:val="both"/>
-      </w:pPr>
-      <w:r>
-        <w:rPr>
-          <w:b/>
-        </w:rPr>
-        <w:t>Photos du chantier</w:t>
-      </w:r>
-      <w:r>
-        <w:t>, en particulier de nuit et en nacelle — indispensables pour la soutenance.</w:t>
-      </w:r>
-    </w:p>
-    <w:p>
-      <w:r>
-        <w:rPr>
-          <w:b/>
-        </w:rPr>
-        <w:t>Priorité 2 — pour renforcer les résultats</w:t>
+        <w:t xml:space="preserve"> et répartition des heures par phase — cela permettrait de chiffrer en euros l'écart du temps de nuit et d'en faire un retour d'expérience exploitable par l'entreprise.</w:t>
       </w:r>
     </w:p>
     <w:p>
@@ -2678,24 +2792,7 @@
         <w:t>Consommations après travaux</w:t>
       </w:r>
       <w:r>
-        <w:t xml:space="preserve"> (ENERGISME ou factures) sur une saison de chauffe complète.</w:t>
-      </w:r>
-    </w:p>
-    <w:p>
-      <w:pPr>
-        <w:pStyle w:val="ListNumber"/>
-        <w:spacing w:after="40"/>
-        <w:ind w:left="397"/>
-        <w:jc w:val="both"/>
-      </w:pPr>
-      <w:r>
-        <w:rPr>
-          <w:b/>
-        </w:rPr>
-        <w:t>Charge réelle de R-410A</w:t>
-      </w:r>
-      <w:r>
-        <w:t xml:space="preserve"> figurant au DOE, pour calculer l'impact potentiel en t CO₂e.</w:t>
+        <w:t xml:space="preserve"> (plateforme ENERGISME ou factures) sur une saison de chauffe complète : c'est ce qui transformera l'estimation de l'audit en résultat démontré.</w:t>
       </w:r>
     </w:p>
     <w:p>
@@ -2712,7 +2809,7 @@
         <w:t>Catégorie ERP</w:t>
       </w:r>
       <w:r>
-        <w:t xml:space="preserve"> du magasin et effectif théorique (registre de sécurité ou dernier PV de commission).</w:t>
+        <w:t xml:space="preserve"> du magasin et effectif théorique (registre de sécurité ou dernier PV de commission de sécurité).</w:t>
       </w:r>
     </w:p>
     <w:p>
@@ -2729,7 +2826,7 @@
         <w:t>Nom et fonction de l'ingénieur énergéticien</w:t>
       </w:r>
       <w:r>
-        <w:t xml:space="preserve"> VINCI Energies auteur de l'audit.</w:t>
+        <w:t xml:space="preserve"> VINCI Energies auteur de l'audit, pour les remerciements et la partie 3.1.3.</w:t>
       </w:r>
     </w:p>
     <w:p>
@@ -2746,7 +2843,7 @@
         <w:t>Date de signature du devis</w:t>
       </w:r>
       <w:r>
-        <w:t xml:space="preserve"> et confirmation du versement de la prime CEE.</w:t>
+        <w:t xml:space="preserve"> et confirmation du versement effectif de la prime CEE de 11 000 €.</w:t>
       </w:r>
     </w:p>
     <w:p>
@@ -2754,7 +2851,7 @@
         <w:rPr>
           <w:b/>
         </w:rPr>
-        <w:t>Priorité 3 — pour la partie 2</w:t>
+        <w:t>Pour compléter la partie 2 (missions globales)</w:t>
       </w:r>
     </w:p>
     <w:p>
@@ -2791,14 +2888,50 @@
       </w:r>
     </w:p>
     <w:p>
-      <w:pPr>
-        <w:pStyle w:val="ListNumber"/>
-        <w:spacing w:after="40"/>
-        <w:ind w:left="397"/>
-        <w:jc w:val="both"/>
-      </w:pPr>
       <w:r>
-        <w:t>Retour écrit du client sur sa satisfaction.</w:t>
+        <w:rPr>
+          <w:b/>
+        </w:rPr>
+        <w:t>Note sur les visuels</w:t>
+      </w:r>
+      <w:r>
+        <w:t xml:space="preserve"> : en l'absence de photos de chantier, le support de soutenance s'appuiera sur les </w:t>
+      </w:r>
+      <w:r>
+        <w:rPr>
+          <w:b/>
+        </w:rPr>
+        <w:t>figures de l'audit</w:t>
+      </w:r>
+      <w:r>
+        <w:t xml:space="preserve"> (répartition des consommations par usage, projection 2030), le </w:t>
+      </w:r>
+      <w:r>
+        <w:rPr>
+          <w:b/>
+        </w:rPr>
+        <w:t>schéma de principe</w:t>
+      </w:r>
+      <w:r>
+        <w:t xml:space="preserve"> du rapport, le </w:t>
+      </w:r>
+      <w:r>
+        <w:rPr>
+          <w:b/>
+        </w:rPr>
+        <w:t>tableau des neuf actions</w:t>
+      </w:r>
+      <w:r>
+        <w:t xml:space="preserve"> et la </w:t>
+      </w:r>
+      <w:r>
+        <w:rPr>
+          <w:b/>
+        </w:rPr>
+        <w:t>décomposition du devis</w:t>
+      </w:r>
+      <w:r>
+        <w:t>. C'est suffisant : un jury retient mieux trois chiffres clés qu'une photo de nacelle.</w:t>
       </w:r>
     </w:p>
     <w:p>

</xml_diff>

<commit_message>
Ajoute le bilan financier reel de l'affaire
- Nouvelle section 3.6.5 : affaire terminee tres legerement beneficiaire,
  la derive du temps de nuit ayant ete compensee par les economies sur les
  achats et la negociation fournisseurs.
- Analyse critique nuancee : la marge prevue a ete consommee, la
  compensation vient d'un levier ponctuel et non reproductible, et un bon
  resultat ne valide pas une estimation fausse.
- Indicateur de conduite de projet et question de soutenance ajoutes.
- Suppression du tableau de cout global redondant, resserrage general.

Co-Authored-By: Claude Opus 5 <noreply@anthropic.com>
Claude-Session: https://claude.ai/code/session_013HeFSL5jx5KnB3FSreC4S1
</commit_message>
<xml_diff>
--- a/rapport/Kit_soutenance_et_pieces_manquantes.docx
+++ b/rapport/Kit_soutenance_et_pieces_manquantes.docx
@@ -603,7 +603,14 @@
               <w:rPr>
                 <w:sz w:val="16"/>
               </w:rPr>
-              <w:t>Structure du budget, CEE, calendrier</w:t>
+              <w:t xml:space="preserve">Devis 90 000 € HT, CEE 11 000 €, calendrier, </w:t>
+            </w:r>
+            <w:r>
+              <w:rPr>
+                <w:b/>
+                <w:sz w:val="16"/>
+              </w:rPr>
+              <w:t>bilan d'affaire</w:t>
             </w:r>
           </w:p>
         </w:tc>
@@ -2552,7 +2559,7 @@
               <w:rPr>
                 <w:sz w:val="16"/>
               </w:rPr>
-              <w:t>Qu'auriez-vous fait différemment ?</w:t>
+              <w:t>Quel a été le bilan financier de l'affaire ?</w:t>
             </w:r>
           </w:p>
         </w:tc>
@@ -2573,35 +2580,29 @@
             </w:r>
             <w:r>
               <w:rPr>
-                <w:sz w:val="16"/>
-              </w:rPr>
-              <w:t xml:space="preserve">R-32 plutôt que R-410A ; </w:t>
-            </w:r>
-            <w:r>
-              <w:rPr>
                 <w:b/>
                 <w:sz w:val="16"/>
               </w:rPr>
-              <w:t>chiffrage du travail de nuit</w:t>
-            </w:r>
-            <w:r>
-              <w:rPr>
-                <w:sz w:val="16"/>
-              </w:rPr>
-              <w:t xml:space="preserve"> avec coefficient de productivité ; </w:t>
+              <w:t>Très légèrement bénéficiaire.</w:t>
+            </w:r>
+            <w:r>
+              <w:rPr>
+                <w:sz w:val="16"/>
+              </w:rPr>
+              <w:t xml:space="preserve"> Le doublement du temps de nuit a absorbé la marge prévue, mais les </w:t>
             </w:r>
             <w:r>
               <w:rPr>
                 <w:b/>
                 <w:sz w:val="16"/>
               </w:rPr>
-              <w:t>sous-comptage du poste chauffage avant travaux</w:t>
-            </w:r>
-            <w:r>
-              <w:rPr>
-                <w:sz w:val="16"/>
-              </w:rPr>
-              <w:t xml:space="preserve"> ; recalcul du TRA après l'écart budget/devis (− 27 %) ; renfort d'équipe sur les phases lourdes</w:t>
+              <w:t>économies sur les achats et la négociation fournisseurs</w:t>
+            </w:r>
+            <w:r>
+              <w:rPr>
+                <w:sz w:val="16"/>
+              </w:rPr>
+              <w:t xml:space="preserve"> l'ont compensé. À dire tel quel : un bon résultat obtenu par un levier ponctuel ne valide pas une estimation fausse</w:t>
             </w:r>
           </w:p>
         </w:tc>
@@ -2625,7 +2626,7 @@
               <w:rPr>
                 <w:sz w:val="16"/>
               </w:rPr>
-              <w:t>Comment prouverez-vous le gain réel ?</w:t>
+              <w:t>Qu'auriez-vous fait différemment ?</w:t>
             </w:r>
           </w:p>
         </w:tc>
@@ -2647,46 +2648,33 @@
               <w:rPr>
                 <w:sz w:val="16"/>
               </w:rPr>
-              <w:t xml:space="preserve">Correction climatique par </w:t>
+              <w:t xml:space="preserve">R-32 plutôt que R-410A ; </w:t>
             </w:r>
             <w:r>
               <w:rPr>
                 <w:b/>
                 <w:sz w:val="16"/>
               </w:rPr>
-              <w:t>DJU</w:t>
-            </w:r>
-            <w:r>
-              <w:rPr>
-                <w:sz w:val="16"/>
-              </w:rPr>
-              <w:t>, raisonnement en kWh avant euros, exploitation d'</w:t>
+              <w:t>chiffrage du travail de nuit</w:t>
+            </w:r>
+            <w:r>
+              <w:rPr>
+                <w:sz w:val="16"/>
+              </w:rPr>
+              <w:t xml:space="preserve"> avec coefficient de productivité ; </w:t>
             </w:r>
             <w:r>
               <w:rPr>
                 <w:b/>
                 <w:sz w:val="16"/>
               </w:rPr>
-              <w:t>ENERGISME</w:t>
-            </w:r>
-            <w:r>
-              <w:rPr>
-                <w:sz w:val="16"/>
-              </w:rPr>
-              <w:t xml:space="preserve"> et de la déclaration </w:t>
-            </w:r>
-            <w:r>
-              <w:rPr>
-                <w:b/>
-                <w:sz w:val="16"/>
-              </w:rPr>
-              <w:t>OPERAT</w:t>
-            </w:r>
-            <w:r>
-              <w:rPr>
-                <w:sz w:val="16"/>
-              </w:rPr>
-              <w:t>, comparaison sur une année pleine minimum</w:t>
+              <w:t>sous-comptage du poste chauffage avant travaux</w:t>
+            </w:r>
+            <w:r>
+              <w:rPr>
+                <w:sz w:val="16"/>
+              </w:rPr>
+              <w:t xml:space="preserve"> ; recalcul du TRA après l'écart budget/devis (− 27 %) ; renfort d'équipe sur les phases lourdes</w:t>
             </w:r>
           </w:p>
         </w:tc>
@@ -2711,7 +2699,7 @@
               <w:rPr>
                 <w:sz w:val="16"/>
               </w:rPr>
-              <w:t>Prise en compte d'un collaborateur en situation de handicap ?</w:t>
+              <w:t>Comment prouverez-vous le gain réel ?</w:t>
             </w:r>
           </w:p>
         </w:tc>
@@ -2719,6 +2707,91 @@
           <w:tcPr>
             <w:tcW w:type="dxa" w:w="5156"/>
             <w:shd w:val="clear" w:fill="EEF2F7"/>
+          </w:tcPr>
+          <w:p>
+            <w:pPr>
+              <w:spacing w:after="0" w:before="0" w:line="240" w:lineRule="auto"/>
+              <w:jc w:val="left"/>
+            </w:pPr>
+            <w:r>
+              <w:rPr>
+                <w:sz w:val="16"/>
+              </w:rPr>
+            </w:r>
+            <w:r>
+              <w:rPr>
+                <w:sz w:val="16"/>
+              </w:rPr>
+              <w:t xml:space="preserve">Correction climatique par </w:t>
+            </w:r>
+            <w:r>
+              <w:rPr>
+                <w:b/>
+                <w:sz w:val="16"/>
+              </w:rPr>
+              <w:t>DJU</w:t>
+            </w:r>
+            <w:r>
+              <w:rPr>
+                <w:sz w:val="16"/>
+              </w:rPr>
+              <w:t>, raisonnement en kWh avant euros, exploitation d'</w:t>
+            </w:r>
+            <w:r>
+              <w:rPr>
+                <w:b/>
+                <w:sz w:val="16"/>
+              </w:rPr>
+              <w:t>ENERGISME</w:t>
+            </w:r>
+            <w:r>
+              <w:rPr>
+                <w:sz w:val="16"/>
+              </w:rPr>
+              <w:t xml:space="preserve"> et de la déclaration </w:t>
+            </w:r>
+            <w:r>
+              <w:rPr>
+                <w:b/>
+                <w:sz w:val="16"/>
+              </w:rPr>
+              <w:t>OPERAT</w:t>
+            </w:r>
+            <w:r>
+              <w:rPr>
+                <w:sz w:val="16"/>
+              </w:rPr>
+              <w:t>, comparaison sur une année pleine minimum</w:t>
+            </w:r>
+          </w:p>
+        </w:tc>
+      </w:tr>
+      <w:tr>
+        <w:tc>
+          <w:tcPr>
+            <w:tcW w:type="dxa" w:w="5156"/>
+          </w:tcPr>
+          <w:p>
+            <w:pPr>
+              <w:spacing w:after="0" w:before="0" w:line="240" w:lineRule="auto"/>
+              <w:jc w:val="left"/>
+            </w:pPr>
+            <w:r>
+              <w:rPr>
+                <w:sz w:val="16"/>
+              </w:rPr>
+            </w:r>
+            <w:r>
+              <w:rPr>
+                <w:sz w:val="16"/>
+              </w:rPr>
+              <w:t>Prise en compte d'un collaborateur en situation de handicap ?</w:t>
+            </w:r>
+          </w:p>
+        </w:tc>
+        <w:tc>
+          <w:tcPr>
+            <w:tcW w:type="dxa" w:w="5156"/>
           </w:tcPr>
           <w:p>
             <w:pPr>

</xml_diff>

<commit_message>
Deuxieme relecture : coherence des sources et affirmations verifiables
- Supprime les mentions residuelles de "DPE" la ou il s'agit de l'audit
  energetique, y compris dans le schema de circulation d'une affaire.
- Corrige l'effectif du groupe VINCI (219 000, aligne sur le livret cite)
  et la presentation des effectifs de l'entreprise.
- Attenue deux formulations qui surevaluaient mon role (page de garde et
  remerciements) et marque le "zero accident" comme a confirmer aupres du QSE.
- Retire les references residuelles au levage en toiture et a la grue,
  sans objet depuis l'implantation des groupes en cour arriere.
- Actualise l'annexe des pieces a joindre : audit, devis et organigramme
  sont desormais disponibles.

Co-Authored-By: Claude Opus 5 <noreply@anthropic.com>
Claude-Session: https://claude.ai/code/session_013HeFSL5jx5KnB3FSreC4S1
</commit_message>
<xml_diff>
--- a/rapport/Kit_soutenance_et_pieces_manquantes.docx
+++ b/rapport/Kit_soutenance_et_pieces_manquantes.docx
@@ -417,7 +417,7 @@
               <w:rPr>
                 <w:sz w:val="16"/>
               </w:rPr>
-              <w:t>Constat, DPE, décret tertiaire, risques encourus</w:t>
+              <w:t>Constat, audit énergétique, décret tertiaire, risques encourus</w:t>
             </w:r>
           </w:p>
         </w:tc>
@@ -3163,7 +3163,7 @@
               <w:rPr>
                 <w:sz w:val="16"/>
               </w:rPr>
-              <w:t>Rapport de DPE du site</w:t>
+              <w:t>Rapport d'audit énergétique du site (visite 17/04/2025, rapport 30/07/2025)</w:t>
             </w:r>
           </w:p>
         </w:tc>
@@ -3186,7 +3186,7 @@
                 <w:b/>
                 <w:sz w:val="16"/>
               </w:rPr>
-              <w:t>Manquant</w:t>
+              <w:t>Disponible</w:t>
             </w:r>
           </w:p>
         </w:tc>
@@ -3234,7 +3234,7 @@
               <w:rPr>
                 <w:sz w:val="16"/>
               </w:rPr>
-              <w:t>Extrait du relevé OPERAT / année de référence</w:t>
+              <w:t>Devis Santerne — décomposition du prix par poste (90 000 € HT)</w:t>
             </w:r>
           </w:p>
         </w:tc>
@@ -3255,9 +3255,16 @@
             </w:r>
             <w:r>
               <w:rPr>
-                <w:sz w:val="16"/>
-              </w:rPr>
-              <w:t>À demander au client</w:t>
+                <w:b/>
+                <w:sz w:val="16"/>
+              </w:rPr>
+              <w:t>Disponible</w:t>
+            </w:r>
+            <w:r>
+              <w:rPr>
+                <w:sz w:val="16"/>
+              </w:rPr>
+              <w:t xml:space="preserve"> — à anonymiser si l'école l'exige</w:t>
             </w:r>
           </w:p>
         </w:tc>
@@ -3303,7 +3310,7 @@
               <w:rPr>
                 <w:sz w:val="16"/>
               </w:rPr>
-              <w:t>Bilan thermique détaillé</w:t>
+              <w:t>Organigramme de l'entreprise 2025</w:t>
             </w:r>
           </w:p>
         </w:tc>
@@ -3323,9 +3330,10 @@
             </w:r>
             <w:r>
               <w:rPr>
-                <w:sz w:val="16"/>
-              </w:rPr>
-              <w:t>À produire</w:t>
+                <w:b/>
+                <w:sz w:val="16"/>
+              </w:rPr>
+              <w:t>Disponible</w:t>
             </w:r>
           </w:p>
         </w:tc>
@@ -3373,7 +3381,7 @@
               <w:rPr>
                 <w:sz w:val="16"/>
               </w:rPr>
-              <w:t>Plans d'implantation et schéma de principe</w:t>
+              <w:t>Attestations CACES® R486, habilitations électriques, attestation d'aptitude fluides</w:t>
             </w:r>
           </w:p>
         </w:tc>
@@ -3394,9 +3402,10 @@
             </w:r>
             <w:r>
               <w:rPr>
-                <w:sz w:val="16"/>
-              </w:rPr>
-              <w:t>À récupérer</w:t>
+                <w:b/>
+                <w:sz w:val="16"/>
+              </w:rPr>
+              <w:t>Disponibles</w:t>
             </w:r>
           </w:p>
         </w:tc>
@@ -3442,7 +3451,7 @@
               <w:rPr>
                 <w:sz w:val="16"/>
               </w:rPr>
-              <w:t>Fiches techniques du matériel installé (UE, UI, régulation)</w:t>
+              <w:t>Fiches techniques DAIKIN (RXYQ36U, FXMQ-250A, Roundflow 125, MADOKA)</w:t>
             </w:r>
           </w:p>
         </w:tc>
@@ -3462,10 +3471,9 @@
             </w:r>
             <w:r>
               <w:rPr>
-                <w:b/>
-                <w:sz w:val="16"/>
-              </w:rPr>
-              <w:t>Manquant</w:t>
+                <w:sz w:val="16"/>
+              </w:rPr>
+              <w:t>À télécharger sur le site constructeur</w:t>
             </w:r>
           </w:p>
         </w:tc>
@@ -3513,7 +3521,7 @@
               <w:rPr>
                 <w:sz w:val="16"/>
               </w:rPr>
-              <w:t>Devis / décomposition du prix global et forfaitaire</w:t>
+              <w:t>Plans d'implantation et schéma de principe</w:t>
             </w:r>
           </w:p>
         </w:tc>
@@ -3536,7 +3544,7 @@
               <w:rPr>
                 <w:sz w:val="16"/>
               </w:rPr>
-              <w:t>À anonymiser si nécessaire</w:t>
+              <w:t>À récupérer (DOE)</w:t>
             </w:r>
           </w:p>
         </w:tc>
@@ -3582,7 +3590,7 @@
               <w:rPr>
                 <w:sz w:val="16"/>
               </w:rPr>
-              <w:t>Attestation CEE / dossier de financement</w:t>
+              <w:t>Attestation CEE / dossier TotalEnergies – GreenFlex</w:t>
             </w:r>
           </w:p>
         </w:tc>
@@ -3652,7 +3660,7 @@
               <w:rPr>
                 <w:sz w:val="16"/>
               </w:rPr>
-              <w:t>Planning de chantier réel</w:t>
+              <w:t>Plan de prévention et analyse de risques du chantier</w:t>
             </w:r>
           </w:p>
         </w:tc>
@@ -3675,7 +3683,7 @@
               <w:rPr>
                 <w:sz w:val="16"/>
               </w:rPr>
-              <w:t>À reconstituer</w:t>
+              <w:t>À récupérer (QSE — J. FAYARD)</w:t>
             </w:r>
           </w:p>
         </w:tc>
@@ -3721,7 +3729,7 @@
               <w:rPr>
                 <w:sz w:val="16"/>
               </w:rPr>
-              <w:t>Plan de prévention et analyse de risques</w:t>
+              <w:t>Permis de feu</w:t>
             </w:r>
           </w:p>
         </w:tc>
@@ -3743,7 +3751,7 @@
               <w:rPr>
                 <w:sz w:val="16"/>
               </w:rPr>
-              <w:t>À récupérer (QSE)</w:t>
+              <w:t>À récupérer</w:t>
             </w:r>
           </w:p>
         </w:tc>
@@ -3791,7 +3799,7 @@
               <w:rPr>
                 <w:sz w:val="16"/>
               </w:rPr>
-              <w:t>Permis de feu</w:t>
+              <w:t>PV de mise en service DAIKIN, dossier DESP et relevés d'équilibrage</w:t>
             </w:r>
           </w:p>
         </w:tc>
@@ -3860,7 +3868,7 @@
               <w:rPr>
                 <w:sz w:val="16"/>
               </w:rPr>
-              <w:t>Attestations CACES R486, habilitations électriques, attestation d'aptitude fluides</w:t>
+              <w:t>PV de réception et levée de réserves</w:t>
             </w:r>
           </w:p>
         </w:tc>
@@ -3882,7 +3890,7 @@
               <w:rPr>
                 <w:sz w:val="16"/>
               </w:rPr>
-              <w:t>Disponibles</w:t>
+              <w:t>À récupérer</w:t>
             </w:r>
           </w:p>
         </w:tc>
@@ -3930,7 +3938,7 @@
               <w:rPr>
                 <w:sz w:val="16"/>
               </w:rPr>
-              <w:t>PV de mise en service et relevés d'équilibrage</w:t>
+              <w:t>Planning de chantier réel (mi-avril → mi-juin 2026)</w:t>
             </w:r>
           </w:p>
         </w:tc>
@@ -3953,7 +3961,7 @@
               <w:rPr>
                 <w:sz w:val="16"/>
               </w:rPr>
-              <w:t>À récupérer</w:t>
+              <w:t>À reconstituer</w:t>
             </w:r>
           </w:p>
         </w:tc>
@@ -3999,7 +4007,7 @@
               <w:rPr>
                 <w:sz w:val="16"/>
               </w:rPr>
-              <w:t>PV de réception et levée de réserves</w:t>
+              <w:t>Extrait du relevé OPERAT / année de référence</w:t>
             </w:r>
           </w:p>
         </w:tc>
@@ -4021,7 +4029,7 @@
               <w:rPr>
                 <w:sz w:val="16"/>
               </w:rPr>
-              <w:t>À récupérer</w:t>
+              <w:t>À demander au client</w:t>
             </w:r>
           </w:p>
         </w:tc>
@@ -4069,7 +4077,7 @@
               <w:rPr>
                 <w:sz w:val="16"/>
               </w:rPr>
-              <w:t>Photos du chantier (avant / pendant / après, de nuit)</w:t>
+              <w:t>Relevés de consommation après travaux (ENERGISME)</w:t>
             </w:r>
           </w:p>
         </w:tc>
@@ -4090,10 +4098,9 @@
             </w:r>
             <w:r>
               <w:rPr>
-                <w:b/>
-                <w:sz w:val="16"/>
-              </w:rPr>
-              <w:t>Fortement recommandé pour la soutenance</w:t>
+                <w:sz w:val="16"/>
+              </w:rPr>
+              <w:t>Non disponible à ce jour</w:t>
             </w:r>
           </w:p>
         </w:tc>
@@ -4139,7 +4146,7 @@
               <w:rPr>
                 <w:sz w:val="16"/>
               </w:rPr>
-              <w:t>Relevés de consommation après travaux</w:t>
+              <w:t>Photos du chantier</w:t>
             </w:r>
           </w:p>
         </w:tc>
@@ -4159,81 +4166,9 @@
             </w:r>
             <w:r>
               <w:rPr>
-                <w:b/>
-                <w:sz w:val="16"/>
-              </w:rPr>
-              <w:t>Manquant</w:t>
-            </w:r>
-          </w:p>
-        </w:tc>
-      </w:tr>
-      <w:tr>
-        <w:tc>
-          <w:tcPr>
-            <w:tcW w:type="dxa" w:w="3438"/>
-            <w:shd w:val="clear" w:fill="EEF2F7"/>
-          </w:tcPr>
-          <w:p>
-            <w:pPr>
-              <w:spacing w:after="0" w:before="0" w:line="240" w:lineRule="auto"/>
-              <w:jc w:val="left"/>
-            </w:pPr>
-            <w:r>
-              <w:rPr>
-                <w:sz w:val="16"/>
-              </w:rPr>
-            </w:r>
-            <w:r>
-              <w:rPr>
-                <w:sz w:val="16"/>
-              </w:rPr>
-              <w:t>B16</w:t>
-            </w:r>
-          </w:p>
-        </w:tc>
-        <w:tc>
-          <w:tcPr>
-            <w:tcW w:type="dxa" w:w="3438"/>
-            <w:shd w:val="clear" w:fill="EEF2F7"/>
-          </w:tcPr>
-          <w:p>
-            <w:pPr>
-              <w:spacing w:after="0" w:before="0" w:line="240" w:lineRule="auto"/>
-              <w:jc w:val="left"/>
-            </w:pPr>
-            <w:r>
-              <w:rPr>
-                <w:sz w:val="16"/>
-              </w:rPr>
-            </w:r>
-            <w:r>
-              <w:rPr>
-                <w:sz w:val="16"/>
-              </w:rPr>
-              <w:t>Organigramme de l'entreprise 2025</w:t>
-            </w:r>
-          </w:p>
-        </w:tc>
-        <w:tc>
-          <w:tcPr>
-            <w:tcW w:type="dxa" w:w="3438"/>
-            <w:shd w:val="clear" w:fill="EEF2F7"/>
-          </w:tcPr>
-          <w:p>
-            <w:pPr>
-              <w:spacing w:after="0" w:before="0" w:line="240" w:lineRule="auto"/>
-              <w:jc w:val="left"/>
-            </w:pPr>
-            <w:r>
-              <w:rPr>
-                <w:sz w:val="16"/>
-              </w:rPr>
-            </w:r>
-            <w:r>
-              <w:rPr>
-                <w:sz w:val="16"/>
-              </w:rPr>
-              <w:t>Disponible</w:t>
+                <w:sz w:val="16"/>
+              </w:rPr>
+              <w:t>Non disponibles — le support s'appuie sur les figures de l'audit</w:t>
             </w:r>
           </w:p>
         </w:tc>

</xml_diff>